<commit_message>
test: trim dead-code tests and consolidate into test.each tables
- Delete admin-content-table.test.tsx (no longer reachable/dead coverage)
- Consolidate repetitive per-case tests into test.each tables in
  candidate-and-admin-utils, error-interceptor, gamification-and-history-
  utils, hr-profile, permissions-and-citations, shared-utils
- Minor fixes in history-published-set, hr-history, practice-session,
  studio-flow
- Sync package-lock.json (devDependencies were declared in package.json
  but missing from the lockfile)
- Sync QA docs (Report5_Test_Report.xlsx, Report5_TestDocumentation.docx,
  TestExecutionGuide.docx, SU26SE102-GSU26SE52_QA_TestCases.xlsx,
  QA_Bug_Summary_Report, sequence-diagrams.drawio) with the trimmed suite
- Add Report7_Thu.docx, remove a retired sequence-diagram file
</commit_message>
<xml_diff>
--- a/docs/qa/QA_Bug_Summary/QA_Bug_Summary_Report.docx
+++ b/docs/qa/QA_Bug_Summary/QA_Bug_Summary_Report.docx
@@ -912,7 +912,7 @@
                 <w:sz w:val="16"/>
                 <w:szCs w:val="16"/>
               </w:rPr>
-              <w:t xml:space="preserve">Disable nút, thêm title="Coming soon". Test: admin-content-table.test.tsx (ACT-2).</w:t>
+              <w:t xml:space="preserve">Disable nút, thêm title="Coming soon". Test hồi quy admin-content-table.test.tsx (ACT-2) đã được gỡ ngày 13/09/2026 vì trang Admin Content bị xoá khỏi sản phẩm (commit 0ff281f).</w:t>
             </w:r>
           </w:p>
         </w:tc>
@@ -942,7 +942,7 @@
                 <w:sz w:val="16"/>
                 <w:szCs w:val="16"/>
               </w:rPr>
-              <w:t xml:space="preserve">Đã sửa</w:t>
+              <w:t xml:space="preserve">Đã sửa (không còn áp dụng: trang đã bị gỡ)</w:t>
             </w:r>
           </w:p>
         </w:tc>
@@ -5027,7 +5027,20 @@
         <w:spacing w:after="80"/>
       </w:pPr>
       <w:r>
-        <w:t xml:space="preserve">Có test hồi quy thật, đã tự chạy lại và xác nhận pass: #1-14 (đã có từ trước), #15 (RGA001-1, có gap kiểm thử đã biết với nguyên nhân gốc), #18 (RAG028-1/2/3, 3/3 pass), #28 (FRC-1..4, 4/4 pass).</w:t>
+        <w:t xml:space="preserve">Có test hồi quy thật, đã tự chạy lại và xác nhận pass: #1-3 và #5-14 (đã có từ trước), #15 (RGA001-1, có gap kiểm thử đã biết với nguyên nhân gốc), #18 (RAG028-1/2/3, 3/3 pass), #28 (FRC-1..4, 4/4 pass).</w:t>
+      </w:r>
+    </w:p>
+    <w:p>
+      <w:pPr>
+        <w:pStyle w:val="ListParagraph"/>
+        <w:numPr>
+          <w:ilvl w:val="0"/>
+          <w:numId w:val="1"/>
+        </w:numPr>
+        <w:spacing w:after="80"/>
+      </w:pPr>
+      <w:r>
+        <w:t xml:space="preserve">1 bug không còn áp dụng (#4): trang Admin Content đã bị gỡ khỏi sản phẩm (commit 0ff281f, 10/09/2026), nên test hồi quy ACT-2 cũng được gỡ khi rút gọn bộ unit test ngày 13/09/2026.</w:t>
       </w:r>
     </w:p>
     <w:p>

</xml_diff>